<commit_message>
v5.5: docs refresh + AdminInvoices compaction
- Document v5.3 select all/clear all + scrollable category-household
  picker in both READMEs (EN + pt-BR).
- Document v5.4 admin-assignable invoice category in both READMEs.
- Regenerate HOUSEHOLD_ADMIN_GUIDE.docx to note that categories on
  invoices are assigned by full admins and shown on the detail panel.
- Update CLAUDE.md: bump current version to v5.5, document role matrix
  and invoice-category RPC flow so future sessions have the context.
- AdminInvoices: tighten state block, consolidate confirm/confirmAction
  helpers, and parallelize signed-URL fetches (one Promise.all instead
  of a sequential loop over attachments). Strip outdated comments.

Co-Authored-By: Claude Opus 4.7 <noreply@anthropic.com>
</commit_message>
<xml_diff>
--- a/docs/HOUSEHOLD_ADMIN_GUIDE.docx
+++ b/docs/HOUSEHOLD_ADMIN_GUIDE.docx
@@ -1621,6 +1621,28 @@
         <w:t xml:space="preserve"> </w:t>
       </w:r>
       <w:r>
+        <w:t xml:space="preserve">-</w:t>
+      </w:r>
+      <w:r>
+        <w:t xml:space="preserve"> </w:t>
+      </w:r>
+      <w:r>
+        <w:rPr>
+          <w:b/>
+          <w:bCs/>
+        </w:rPr>
+        <w:t xml:space="preserve">Category</w:t>
+      </w:r>
+      <w:r>
+        <w:t xml:space="preserve"> </w:t>
+      </w:r>
+      <w:r>
+        <w:t xml:space="preserve">(if the full admin assigned one — e.g. Plumbing, Materials, Utilities)</w:t>
+      </w:r>
+      <w:r>
+        <w:t xml:space="preserve"> </w:t>
+      </w:r>
+      <w:r>
         <w:t xml:space="preserve">- Service period</w:t>
       </w:r>
       <w:r>
@@ -1696,6 +1718,18 @@
       </w:pPr>
       <w:r>
         <w:t xml:space="preserve">You cannot delete or edit an invoice. If an invoice is wrong, message the full admin.</w:t>
+      </w:r>
+    </w:p>
+    <w:p>
+      <w:pPr>
+        <w:pStyle w:val="Compact"/>
+        <w:numPr>
+          <w:ilvl w:val="0"/>
+          <w:numId w:val="1008"/>
+        </w:numPr>
+      </w:pPr>
+      <w:r>
+        <w:t xml:space="preserve">You cannot assign a category to an invoice — full admins do that so spending rolls up correctly in Analytics. You’ll see the category on the detail panel once it’s been set.</w:t>
       </w:r>
     </w:p>
     <w:bookmarkEnd w:id="19"/>

</xml_diff>